<commit_message>
no more stupid maps
</commit_message>
<xml_diff>
--- a/output/supplementals/geography_supplement.docx
+++ b/output/supplementals/geography_supplement.docx
@@ -39746,183 +39746,6 @@
         </w:tc>
       </w:tr>
     </w:tbl>
-    <w:p>
-      <w:pPr/>
-      <w:r>
-        <w:br w:type="page"/>
-      </w:r>
-    </w:p>
-    <w:p>
-      <w:pPr>
-        <w:pStyle w:val="Normal"/>
-      </w:pPr>
-      <w:r>
-        <w:rPr/>
-        <w:drawing>
-          <wp:inline distT="0" distB="0" distL="0" distR="0">
-            <wp:extent cx="5943600" cy="3959352"/>
-            <wp:docPr id="1" name="" descr=""/>
-            <wp:cNvGraphicFramePr>
-              <a:graphicFrameLocks xmlns:a="http://schemas.openxmlformats.org/drawingml/2006/main" noChangeAspect="1"/>
-            </wp:cNvGraphicFramePr>
-            <a:graphic xmlns:a="http://schemas.openxmlformats.org/drawingml/2006/main">
-              <a:graphicData uri="http://schemas.openxmlformats.org/drawingml/2006/picture">
-                <pic:pic xmlns:pic="http://schemas.openxmlformats.org/drawingml/2006/picture">
-                  <pic:nvPicPr>
-                    <pic:cNvPr id="2" name=""/>
-                    <pic:cNvPicPr>
-                      <a:picLocks noChangeAspect="1" noChangeArrowheads="1"/>
-                    </pic:cNvPicPr>
-                  </pic:nvPicPr>
-                  <pic:blipFill>
-                    <a:blip r:embed="rId7"/>
-                    <a:stretch>
-                      <a:fillRect/>
-                    </a:stretch>
-                  </pic:blipFill>
-                  <pic:spPr bwMode="auto">
-                    <a:xfrm>
-                      <a:off x="0" y="0"/>
-                      <a:ext cx="5943600" cy="3959352"/>
-                    </a:xfrm>
-                    <a:prstGeom prst="rect">
-                      <a:avLst/>
-                    </a:prstGeom>
-                    <a:noFill/>
-                  </pic:spPr>
-                </pic:pic>
-              </a:graphicData>
-            </a:graphic>
-          </wp:inline>
-        </w:drawing>
-      </w:r>
-    </w:p>
-    <w:p>
-      <w:pPr>
-        <w:pStyle w:val="Normal"/>
-      </w:pPr>
-      <w:r>
-        <w:t xml:space="preserve">Figure S6. Studies by continent.</w:t>
-      </w:r>
-    </w:p>
-    <w:p>
-      <w:pPr/>
-      <w:r>
-        <w:br w:type="page"/>
-      </w:r>
-    </w:p>
-    <w:p>
-      <w:pPr>
-        <w:pStyle w:val="Normal"/>
-      </w:pPr>
-      <w:r>
-        <w:rPr/>
-        <w:drawing>
-          <wp:inline distT="0" distB="0" distL="0" distR="0">
-            <wp:extent cx="5943600" cy="3959352"/>
-            <wp:docPr id="3" name="" descr=""/>
-            <wp:cNvGraphicFramePr>
-              <a:graphicFrameLocks xmlns:a="http://schemas.openxmlformats.org/drawingml/2006/main" noChangeAspect="1"/>
-            </wp:cNvGraphicFramePr>
-            <a:graphic xmlns:a="http://schemas.openxmlformats.org/drawingml/2006/main">
-              <a:graphicData uri="http://schemas.openxmlformats.org/drawingml/2006/picture">
-                <pic:pic xmlns:pic="http://schemas.openxmlformats.org/drawingml/2006/picture">
-                  <pic:nvPicPr>
-                    <pic:cNvPr id="4" name=""/>
-                    <pic:cNvPicPr>
-                      <a:picLocks noChangeAspect="1" noChangeArrowheads="1"/>
-                    </pic:cNvPicPr>
-                  </pic:nvPicPr>
-                  <pic:blipFill>
-                    <a:blip r:embed="rId8"/>
-                    <a:stretch>
-                      <a:fillRect/>
-                    </a:stretch>
-                  </pic:blipFill>
-                  <pic:spPr bwMode="auto">
-                    <a:xfrm>
-                      <a:off x="0" y="0"/>
-                      <a:ext cx="5943600" cy="3959352"/>
-                    </a:xfrm>
-                    <a:prstGeom prst="rect">
-                      <a:avLst/>
-                    </a:prstGeom>
-                    <a:noFill/>
-                  </pic:spPr>
-                </pic:pic>
-              </a:graphicData>
-            </a:graphic>
-          </wp:inline>
-        </w:drawing>
-      </w:r>
-    </w:p>
-    <w:p>
-      <w:pPr>
-        <w:pStyle w:val="Normal"/>
-      </w:pPr>
-      <w:r>
-        <w:t xml:space="preserve">Figure S7. Studies by country.</w:t>
-      </w:r>
-    </w:p>
-    <w:p>
-      <w:pPr/>
-      <w:r>
-        <w:br w:type="page"/>
-      </w:r>
-    </w:p>
-    <w:p>
-      <w:pPr>
-        <w:pStyle w:val="Normal"/>
-      </w:pPr>
-      <w:r>
-        <w:rPr/>
-        <w:drawing>
-          <wp:inline distT="0" distB="0" distL="0" distR="0">
-            <wp:extent cx="5943600" cy="3959352"/>
-            <wp:docPr id="5" name="" descr=""/>
-            <wp:cNvGraphicFramePr>
-              <a:graphicFrameLocks xmlns:a="http://schemas.openxmlformats.org/drawingml/2006/main" noChangeAspect="1"/>
-            </wp:cNvGraphicFramePr>
-            <a:graphic xmlns:a="http://schemas.openxmlformats.org/drawingml/2006/main">
-              <a:graphicData uri="http://schemas.openxmlformats.org/drawingml/2006/picture">
-                <pic:pic xmlns:pic="http://schemas.openxmlformats.org/drawingml/2006/picture">
-                  <pic:nvPicPr>
-                    <pic:cNvPr id="6" name=""/>
-                    <pic:cNvPicPr>
-                      <a:picLocks noChangeAspect="1" noChangeArrowheads="1"/>
-                    </pic:cNvPicPr>
-                  </pic:nvPicPr>
-                  <pic:blipFill>
-                    <a:blip r:embed="rId9"/>
-                    <a:stretch>
-                      <a:fillRect/>
-                    </a:stretch>
-                  </pic:blipFill>
-                  <pic:spPr bwMode="auto">
-                    <a:xfrm>
-                      <a:off x="0" y="0"/>
-                      <a:ext cx="5943600" cy="3959352"/>
-                    </a:xfrm>
-                    <a:prstGeom prst="rect">
-                      <a:avLst/>
-                    </a:prstGeom>
-                    <a:noFill/>
-                  </pic:spPr>
-                </pic:pic>
-              </a:graphicData>
-            </a:graphic>
-          </wp:inline>
-        </w:drawing>
-      </w:r>
-    </w:p>
-    <w:p>
-      <w:pPr>
-        <w:pStyle w:val="Normal"/>
-      </w:pPr>
-      <w:r>
-        <w:t xml:space="preserve">Figure S8. Studies by state or province.</w:t>
-      </w:r>
-    </w:p>
     <w:sectPr>
       <w:pgMar w:header="708" w:bottom="1440" w:top="1440" w:right="1440" w:left="1440" w:footer="708" w:gutter="0"/>
       <w:pgSz w:h="16838" w:w="11906" w:orient="portrait"/>

</xml_diff>